<commit_message>
Procedura AML/CFT: opisowe nazwy pól zamiast [●], rozróżnianie etykiet
W pliku wzoru 19 pól [●] dostało nazwy (KRS, NIP, Nr uchwały Zarządu, ...).
Formularz: pola o tej samej etykiecie (np. z jednej komórki tabeli)
dostają dopisaną nazwę pola, żeby dało się je odróżnić.

Co-Authored-By: Claude Opus 5.5 <noreply@anthropic.com>
Claude-Session: https://claude.ai/code/session_013fh3jj28gn4R3CRGmuxMdU
</commit_message>
<xml_diff>
--- a/src/lib/document-templates/Procedura_AML_CFT_wzor_B2B.docx
+++ b/src/lib/document-templates/Procedura_AML_CFT_wzor_B2B.docx
@@ -16,7 +16,7 @@
         <w:pStyle w:val="FirstParagraph"/>
       </w:pPr>
       <w:r>
-        <w:t xml:space="preserve">Wzór gotowy do dostosowania: pola w [nawiasach kwadratowych] uzupełnia Spółka, a przed przyjęciem uchwałą Zarządu procedurę należy zestawić z aktualną oceną ryzyka i zweryfikować z prawnikiem AML.</w:t>
+        <w:t xml:space="preserve">Wzór gotowy do dostosowania: pola w nawiasach kwadratowych uzupełnia Spółka, a przed przyjęciem uchwałą Zarządu procedurę należy zestawić z aktualną oceną ryzyka i zweryfikować z prawnikiem AML.</w:t>
       </w:r>
     </w:p>
     <w:bookmarkStart w:id="20" w:name="metryczka"/>
@@ -114,7 +114,7 @@
               <w:rPr>
                 <w:sz w:val="19"/>
               </w:rPr>
-              <w:t xml:space="preserve">[Nazwa spółki], KRS [●], NIP [●]</w:t>
+              <w:t xml:space="preserve">[Nazwa spółki], KRS [KRS], NIP [NIP]</w:t>
             </w:r>
           </w:p>
         </w:tc>
@@ -210,7 +210,7 @@
               <w:rPr>
                 <w:sz w:val="19"/>
               </w:rPr>
-              <w:t xml:space="preserve">Uchwała Zarządu nr [●] z dnia [●]</w:t>
+              <w:t xml:space="preserve">Uchwała Zarządu nr [Nr uchwały Zarządu] z dnia [Data uchwały Zarządu]</w:t>
             </w:r>
           </w:p>
         </w:tc>
@@ -306,7 +306,7 @@
               <w:rPr>
                 <w:sz w:val="19"/>
               </w:rPr>
-              <w:t xml:space="preserve">[●] (nie rzadziej niż co 12 miesięcy)</w:t>
+              <w:t xml:space="preserve">[Data najbliższego przeglądu] (nie rzadziej niż co 12 miesięcy)</w:t>
             </w:r>
           </w:p>
         </w:tc>
@@ -1020,7 +1020,7 @@
               <w:rPr>
                 <w:sz w:val="19"/>
               </w:rPr>
-              <w:t xml:space="preserve">[●]</w:t>
+              <w:t xml:space="preserve">[Członek Zarządu ds. AML – imię i nazwisko]</w:t>
             </w:r>
           </w:p>
         </w:tc>
@@ -1067,7 +1067,7 @@
               <w:rPr>
                 <w:sz w:val="19"/>
               </w:rPr>
-              <w:t xml:space="preserve">[●], zastępca: [●]</w:t>
+              <w:t xml:space="preserve">[AML Officer – imię i nazwisko], zastępca: [Zastępca AML Officera – imię i nazwisko]</w:t>
             </w:r>
           </w:p>
         </w:tc>
@@ -1161,7 +1161,7 @@
               <w:rPr>
                 <w:sz w:val="19"/>
               </w:rPr>
-              <w:t xml:space="preserve">[●]</w:t>
+              <w:t xml:space="preserve">[Księgowość / obsługa spłat – osoba odpowiedzialna]</w:t>
             </w:r>
           </w:p>
         </w:tc>
@@ -1208,7 +1208,7 @@
               <w:rPr>
                 <w:sz w:val="19"/>
               </w:rPr>
-              <w:t xml:space="preserve">[●]</w:t>
+              <w:t xml:space="preserve">[Windykacja – osoba odpowiedzialna]</w:t>
             </w:r>
           </w:p>
         </w:tc>
@@ -2461,7 +2461,7 @@
         <w:t xml:space="preserve"> </w:t>
       </w:r>
       <w:r>
-        <w:t xml:space="preserve">Imię i nazwisko, obywatelstwo, PESEL lub data urodzenia, seria i numer dokumentu tożsamości, adres. Weryfikacja: oryginał dokumentu przy spotkaniu albo weryfikacja zdalna (dokument + biometria twarzy) przez dostawcę [●]. Pełnomocnictwo w formie co najmniej odpowiadającej czynności.</w:t>
+        <w:t xml:space="preserve">Imię i nazwisko, obywatelstwo, PESEL lub data urodzenia, seria i numer dokumentu tożsamości, adres. Weryfikacja: oryginał dokumentu przy spotkaniu albo weryfikacja zdalna (dokument + biometria twarzy) przez dostawcę [Dostawca weryfikacji zdalnej]. Pełnomocnictwo w formie co najmniej odpowiadającej czynności.</w:t>
       </w:r>
     </w:p>
     <w:p>
@@ -4472,7 +4472,7 @@
         <w:pStyle w:val="Compact"/>
       </w:pPr>
       <w:r>
-        <w:t xml:space="preserve">☐ Odpis KRS / CEIDG pobrany przez Spółkę, data: [●]</w:t>
+        <w:t xml:space="preserve">☐ Odpis KRS / CEIDG pobrany przez Spółkę, data: [Data pobrania odpisu KRS / CEIDG]</w:t>
       </w:r>
     </w:p>
     <w:p>
@@ -4568,7 +4568,7 @@
         <w:pStyle w:val="Compact"/>
       </w:pPr>
       <w:r>
-        <w:t xml:space="preserve">☐ Karta Oceny Ryzyka wypełniona; kategoria: [●]</w:t>
+        <w:t xml:space="preserve">☐ Karta Oceny Ryzyka wypełniona; kategoria: [Kategoria ryzyka]</w:t>
       </w:r>
     </w:p>
     <w:p>
@@ -4990,7 +4990,7 @@
         <w:pStyle w:val="BodyText"/>
       </w:pPr>
       <w:r>
-        <w:t xml:space="preserve">Data oceny: [●] · Oceniający: [●] · Zatwierdzający: [●] · Następny przegląd: [●]</w:t>
+        <w:t xml:space="preserve">Data oceny: [Data oceny ryzyka] · Oceniający: [Oceniający] · Zatwierdzający: [Zatwierdzający] · Następny przegląd: [Data następnego przeglądu ryzyka]</w:t>
       </w:r>
     </w:p>
     <w:p>
@@ -5010,7 +5010,7 @@
         <w:pStyle w:val="BodyText"/>
       </w:pPr>
       <w:r>
-        <w:t xml:space="preserve">Oświadczam, że beneficjentem rzeczywistym [nazwa Klienta] jest/są: [imię, nazwisko, PESEL/data urodzenia, obywatelstwo, sposób i zakres kontroli]. Oświadczam, że [jestem / nie jestem] osobą zajmującą eksponowane stanowisko polityczne, członkiem rodziny takiej osoby ani jej bliskim współpracownikiem. Środki na spłatę pożyczki będą pochodzić z: [●]. Zobowiązuję się niezwłocznie informować o zmianie powyższych danych. Jestem świadomy odpowiedzialności karnej za złożenie fałszywego oświadczenia.</w:t>
+        <w:t xml:space="preserve">Oświadczam, że beneficjentem rzeczywistym [nazwa Klienta] jest/są: [imię, nazwisko, PESEL/data urodzenia, obywatelstwo, sposób i zakres kontroli]. Oświadczam, że [jestem / nie jestem] osobą zajmującą eksponowane stanowisko polityczne, członkiem rodziny takiej osoby ani jej bliskim współpracownikiem. Środki na spłatę pożyczki będą pochodzić z: [Źródło środków na spłatę]. Zobowiązuję się niezwłocznie informować o zmianie powyższych danych. Jestem świadomy odpowiedzialności karnej za złożenie fałszywego oświadczenia.</w:t>
       </w:r>
     </w:p>
     <w:p>
@@ -5334,7 +5334,7 @@
         <w:pStyle w:val="BodyText"/>
       </w:pPr>
       <w:r>
-        <w:t xml:space="preserve">Oświadczam, że zapoznałem/am się z Procedurą wewnętrzną AML/CFT w wersji [●] i zobowiązuję się do jej przestrzegania.</w:t>
+        <w:t xml:space="preserve">Oświadczam, że zapoznałem/am się z Procedurą wewnętrzną AML/CFT w wersji [Wersja procedury] i zobowiązuję się do jej przestrzegania.</w:t>
       </w:r>
     </w:p>
     <w:p>

</xml_diff>